<commit_message>
Update PDF and DOCX with user's customized LaTeX code
</commit_message>
<xml_diff>
--- a/Inno_โฟร์_3_Con.docx
+++ b/Inno_โฟร์_3_Con.docx
@@ -20,14 +20,14 @@
         <w:br/>
       </w:r>
       <w:r>
-        <w:t xml:space="preserve"> </w:t>
-      </w:r>
-      <w:r>
         <w:rPr>
           <w:bCs/>
           <w:b/>
         </w:rPr>
-        <w:t xml:space="preserve">ระบบปฏิบัติการร่วมศูนย์ Club OS: การจัดการข้อมูลและการคิดเชิงระบบเพื่อขับเคลื่อนชมรม</w:t>
+        <w:t xml:space="preserve">ระบบบริหารจัดการข้อมูลและนวัตกรรมอัตโนมัติสําหรับชมรม Chula Tech Startup 2026</w:t>
+      </w:r>
+      <w:r>
+        <w:t xml:space="preserve"> </w:t>
       </w:r>
       <w:r>
         <w:br/>
@@ -132,13 +132,13 @@
         </w:pict>
       </w:r>
     </w:p>
-    <w:bookmarkStart w:id="28" w:name="X827a437c3a646a548e6d0a053026c1d4ee47568"/>
+    <w:bookmarkStart w:id="28" w:name="Xd2793dcb896edaabbbe245cda058f12f86e7cb2"/>
     <w:p>
       <w:pPr>
         <w:pStyle w:val="Heading1"/>
       </w:pPr>
       <w:r>
-        <w:t xml:space="preserve">ฝ่าย Marketing: ระบบดึงข้อมูล วิเคราะห์ และแสดงผลคอนเทนต์อัตโนมัติ "Social Pulse"</w:t>
+        <w:t xml:space="preserve">ฝ่าย Marketing: ระบบดึงข้อมูล วิเคราะห์ และแสดงผลคอนเทนต์อัตโนมัติ "Zocial Tracker"</w:t>
       </w:r>
     </w:p>
     <w:p>
@@ -224,13 +224,13 @@
         <w:t xml:space="preserve">(4) แสดงผลบน Dashboard</w:t>
       </w:r>
     </w:p>
-    <w:bookmarkStart w:id="21" w:name="X86e9a8480ebffdce5cb23ef385de29d267b70c9"/>
+    <w:bookmarkStart w:id="21" w:name="ทำไมถงตองสรางระบบน-swot-analysis"/>
     <w:p>
       <w:pPr>
         <w:pStyle w:val="Heading2"/>
       </w:pPr>
       <w:r>
-        <w:t xml:space="preserve">การวิเคราะห์สถานการณ์เพื่อความก้าวหน้าเชิงระบบด้วย SWOT Analysis</w:t>
+        <w:t xml:space="preserve">ทำไมถึงต้องสร้างระบบนี้? (SWOT Analysis)</w:t>
       </w:r>
     </w:p>
     <w:p>
@@ -238,7 +238,7 @@
         <w:pStyle w:val="FirstParagraph"/>
       </w:pPr>
       <w:r>
-        <w:t xml:space="preserve">เพื่อให้การประเมินปัญหามีความกระชับ ตรงจุด และสะท้อนกรอบการคิดเชิงระบบ (Systems Thinking) ฝ่าย Innovation ได้นำเครื่องมือ SWOT Analysis มาจำแนกจุดแข็ง จุดอ่อน โอกาส และอุปสรรค สำหรับการทำงานของแผนกการตลาดของชมรม ดังแสดงในแผนภาพด้านล่าง:</w:t>
+        <w:t xml:space="preserve">ก่อนเริ่มวางระบบ ผมได้นำ SWOT Analysis มาใช้วิเคราะห์ประเมินสภาพปัญหารของชมรม เพื่อระบุปัญหาและนำระบบเข้ามาช่วยแก้ไขปัญหาและทำงานแทนจุดนั้น ดังแสดงในแผนภาพด้านล่าง</w:t>
       </w:r>
     </w:p>
     <w:p>
@@ -250,7 +250,7 @@
           <wp:inline>
             <wp:extent cx="5334000" cy="2490208"/>
             <wp:effectExtent b="0" l="0" r="0" t="0"/>
-            <wp:docPr descr="แผนภาพการวิเคราะห์ SWOT Matrix สำหรับงานบริหารจัดการข้อมูลการตลาดของชมรม" title="" id="1" name="Picture"/>
+            <wp:docPr descr="แผนภาพการวิเคราะห์ SWOT Matrix สำหรับงานบริหารจัดการข้อมูลของชมรม" title="" id="1" name="Picture"/>
             <a:graphic>
               <a:graphicData uri="http://schemas.openxmlformats.org/drawingml/2006/picture">
                 <pic:pic>
@@ -293,17 +293,17 @@
         <w:pStyle w:val="ImageCaption"/>
       </w:pPr>
       <w:r>
-        <w:t xml:space="preserve">แผนภาพการวิเคราะห์ SWOT Matrix สำหรับงานบริหารจัดการข้อมูลการตลาดของชมรม</w:t>
+        <w:t xml:space="preserve">แผนภาพการวิเคราะห์ SWOT Matrix สำหรับงานบริหารจัดการข้อมูลของชมรม</w:t>
       </w:r>
     </w:p>
     <w:bookmarkEnd w:id="21"/>
-    <w:bookmarkStart w:id="23" w:name="Xf0b314af7bfbd0bac14c53d4cff140427ce036b"/>
+    <w:bookmarkStart w:id="23" w:name="X77b2a8f4fb6f2dd97906e21c14c3ce82f88999a"/>
     <w:p>
       <w:pPr>
         <w:pStyle w:val="Heading2"/>
       </w:pPr>
       <w:r>
-        <w:t xml:space="preserve">สถาปัตยกรรมการรับข้อมูล 3 ระดับ (Tiered Data Acquisition Architecture)</w:t>
+        <w:t xml:space="preserve">ขั้นที่ 1 — ดึงข้อมูล: ระบบดึงสถิติอัตโนมัติเพื่อป้องกันข้อผิดพลาด (No Single Point of Failure)</w:t>
       </w:r>
     </w:p>
     <w:p>
@@ -311,15 +311,7 @@
         <w:pStyle w:val="FirstParagraph"/>
       </w:pPr>
       <w:r>
-        <w:t xml:space="preserve">เพื่อให้มั่นใจว่าระบบจะรวบรวมสถิติได้ครบถ้วนโดยไม่มีคนเข้ามาจดบันทึก ระบบใช้เครื่องมือ</w:t>
-      </w:r>
-    </w:p>
-    <w:p>
-      <w:pPr>
-        <w:pStyle w:val="BodyText"/>
-      </w:pPr>
-      <w:r>
-        <w:t xml:space="preserve">เป็นตัวควบคุมหลัก (Workflow Orchestrator) ในการสลับช่องทางการรับข้อมูลอัตโนมัติดังนี้:</w:t>
+        <w:t xml:space="preserve">ในการใช้งานจริง API ของโซเชียลมีเดียมักมีการจำกัดสิทธิ์เข้าถึง ระบบจึงออกแบบช่องทางสำรอง 3 เลเยอร์ หากเลเยอร์หลักทำงานไมไ่ด้ ระบบจะสลับไปใช้ระดับสำรองเพื่อให้มั่นใจว่าสามารถดึงข้อมูลได้</w:t>
       </w:r>
     </w:p>
     <w:p>
@@ -334,10 +326,10 @@
           <w:bCs/>
           <w:b/>
         </w:rPr>
-        <w:t xml:space="preserve">Official API (วิธีหลัก)</w:t>
-      </w:r>
-      <w:r>
-        <w:t xml:space="preserve">: n8n ยิงขอข้อมูลตรงผ่าน</w:t>
+        <w:t xml:space="preserve">API (วิธีหลัก)</w:t>
+      </w:r>
+      <w:r>
+        <w:t xml:space="preserve">:</w:t>
       </w:r>
     </w:p>
     <w:p>
@@ -348,7 +340,7 @@
         </w:numPr>
       </w:pPr>
       <w:r>
-        <w:t xml:space="preserve">และ</w:t>
+        <w:t xml:space="preserve">ยิงคำขอไปที่</w:t>
       </w:r>
     </w:p>
     <w:p>
@@ -359,6 +351,17 @@
         </w:numPr>
       </w:pPr>
       <w:r>
+        <w:t xml:space="preserve">และ</w:t>
+      </w:r>
+    </w:p>
+    <w:p>
+      <w:pPr>
+        <w:numPr>
+          <w:ilvl w:val="0"/>
+          <w:numId w:val="1000"/>
+        </w:numPr>
+      </w:pPr>
+      <w:r>
         <w:t xml:space="preserve">ในช่วงเวลา 02:00 น. เพื่อเลี่ยงข้อจำกัดการรับส่งข้อมูล (Rate Limit) ดึงสถิติตัวเลข reach, impressions, likes, comments, shares, saves</w:t>
       </w:r>
     </w:p>
@@ -374,10 +377,10 @@
           <w:bCs/>
           <w:b/>
         </w:rPr>
-        <w:t xml:space="preserve">Automation Fallback (ทางเลือกสำรองอัตโนมัติ)</w:t>
-      </w:r>
-      <w:r>
-        <w:t xml:space="preserve">: หาก Tier 1 ล้มเหลวหรือไม่มีสิทธิ์ API ตัว n8n จะย้ายมารันระบบเบราว์เซอร์จำลองโดยอัตโนมัติ:</w:t>
+        <w:t xml:space="preserve">เบราว์เซอร์จำลองอัตโนมัติ (วิธีสำรอง)</w:t>
+      </w:r>
+      <w:r>
+        <w:t xml:space="preserve">: หากติดปัญหาเรื่องสิทธิ์ API ระบบจะสลับมาเปิดเว็บเบราว์เซอร์เสมือนเพื่อเข้าไปคัดลอกตัวเลขสถิติแทน โดยแบ่งเป็น 2 วิธีย่อย คือ</w:t>
       </w:r>
     </w:p>
     <w:p>
@@ -392,7 +395,7 @@
           <w:bCs/>
           <w:b/>
         </w:rPr>
-        <w:t xml:space="preserve">วิธีที่ 2a Playwright + AI Vision</w:t>
+        <w:t xml:space="preserve">วิธี 2a — ถ่ายภาพหน้าจอให้ AI อ่าน (AI Vision)</w:t>
       </w:r>
       <w:r>
         <w:t xml:space="preserve">: ใช้</w:t>
@@ -406,7 +409,7 @@
         </w:numPr>
       </w:pPr>
       <w:r>
-        <w:t xml:space="preserve">ล็อกอินเข้าไปหน้า Analytics แล้วเซฟภาพหน้าจอ (Screenshot) จากนั้นส่งให้</w:t>
+        <w:t xml:space="preserve">ล็อกอินเข้าหน้า Analytics แล้วแคปเจอร์หน้าจอ จากนั้นส่งให้</w:t>
       </w:r>
     </w:p>
     <w:p>
@@ -417,7 +420,7 @@
         </w:numPr>
       </w:pPr>
       <w:r>
-        <w:t xml:space="preserve">สกัดตัวเลขกลับมาเป็น JSON</w:t>
+        <w:t xml:space="preserve">แกะข้อมูลรูปภาพออกมาเป็น JSON</w:t>
       </w:r>
     </w:p>
     <w:p>
@@ -432,10 +435,10 @@
           <w:bCs/>
           <w:b/>
         </w:rPr>
-        <w:t xml:space="preserve">วิธีที่ 2b MCP Browser Agent</w:t>
-      </w:r>
-      <w:r>
-        <w:t xml:space="preserve">: ใช้มาตรฐานโพรโทคอล</w:t>
+        <w:t xml:space="preserve">วิธี 2b — AI Agent ควบคุมเบราว์เซอร์ (MCP Browser)</w:t>
+      </w:r>
+      <w:r>
+        <w:t xml:space="preserve">: ใช้มาตรฐาน</w:t>
       </w:r>
     </w:p>
     <w:p>
@@ -446,7 +449,7 @@
         </w:numPr>
       </w:pPr>
       <w:r>
-        <w:t xml:space="preserve">เชื่อม AI Agent สั่งการเบราว์เซอร์จำลองด้วยภาษาคน เพื่อเข้าไปอ่านค่าและส่งกลับมาเป็นข้อมูลดิบ</w:t>
+        <w:t xml:space="preserve">เชื่อม AI Agent ควบคุมเบราว์เซอร์จำลองโดยใช้คำสั่งภาษาธรรมชาติเพื่อดึงค่าจากหน้าสรุปผล</w:t>
       </w:r>
     </w:p>
     <w:p>
@@ -461,10 +464,10 @@
           <w:bCs/>
           <w:b/>
         </w:rPr>
-        <w:t xml:space="preserve">Apify Scrapers (ช่องทางสุดท้าย)</w:t>
-      </w:r>
-      <w:r>
-        <w:t xml:space="preserve">: เรียกใช้ API ของ</w:t>
+        <w:t xml:space="preserve">Apify Scrapers (วิธีสุดท้าย)</w:t>
+      </w:r>
+      <w:r>
+        <w:t xml:space="preserve">: เรียกใช้บอทของ</w:t>
       </w:r>
     </w:p>
     <w:p>
@@ -475,7 +478,7 @@
         </w:numPr>
       </w:pPr>
       <w:r>
-        <w:t xml:space="preserve">เพื่อรันบอทสแกนหน้าเว็บสาธารณะของโพสต์นั้นๆ และสกัดสถิติกลับมาจัดเก็บ</w:t>
+        <w:t xml:space="preserve">เพื่อสแกนหน้าเว็บสาธารณะของโพสต์นั้นๆ และเก็บยอดวิว ยอดไลก์ และสถิติสาธารณะกลับมาจัดเก็บลงระบบ</w:t>
       </w:r>
     </w:p>
     <w:p>
@@ -487,7 +490,7 @@
           <wp:inline>
             <wp:extent cx="4672920" cy="2526068"/>
             <wp:effectExtent b="0" l="0" r="0" t="0"/>
-            <wp:docPr descr="สถาปัตยกรรมการรับส่งข้อมูล 3 ระดับของระบบ Social Pulse" title="" id="1" name="Picture"/>
+            <wp:docPr descr="แผนภาพการทำงานของระบบ Zocial Tracler" title="" id="1" name="Picture"/>
             <a:graphic>
               <a:graphicData uri="http://schemas.openxmlformats.org/drawingml/2006/picture">
                 <pic:pic>
@@ -530,17 +533,25 @@
         <w:pStyle w:val="ImageCaption"/>
       </w:pPr>
       <w:r>
-        <w:t xml:space="preserve">สถาปัตยกรรมการรับส่งข้อมูล 3 ระดับของระบบ Social Pulse</w:t>
+        <w:t xml:space="preserve">แผนภาพการทำงานของระบบ Zocial Tracler</w:t>
       </w:r>
     </w:p>
     <w:bookmarkEnd w:id="23"/>
-    <w:bookmarkStart w:id="24" w:name="การจดเกบและโครงสรางขอมล-storage-layers"/>
+    <w:bookmarkStart w:id="24" w:name="ขนท-2-เกบขอมล-การเกบขอมลลงระบบศนยกลาง"/>
     <w:p>
       <w:pPr>
         <w:pStyle w:val="Heading2"/>
       </w:pPr>
       <w:r>
-        <w:t xml:space="preserve">การจัดเก็บและโครงสร้างข้อมูล (Storage Layers)</w:t>
+        <w:t xml:space="preserve">ขั้นที่ 2 — เก็บข้อมูล: การเก็บข้อมูลลงระบบศูนย์กลาง</w:t>
+      </w:r>
+    </w:p>
+    <w:p>
+      <w:pPr>
+        <w:pStyle w:val="FirstParagraph"/>
+      </w:pPr>
+      <w:r>
+        <w:t xml:space="preserve">เมื่อดึงสถิติกลับมาแล้ว ข้อมูลจะจัดเก็บ 2 ชั้นที่ทำหน้าที่ประสานงานกัน เพื่อความสะดวกในการใช้งานต่อไป</w:t>
       </w:r>
     </w:p>
     <w:p>
@@ -558,7 +569,7 @@
         <w:t xml:space="preserve">Operational Layer</w:t>
       </w:r>
       <w:r>
-        <w:t xml:space="preserve">: จัดเก็บชั่วคราวใน</w:t>
+        <w:t xml:space="preserve">: จัดเก็บข้อมูลเบื้องต้นลงใน</w:t>
       </w:r>
     </w:p>
     <w:p>
@@ -569,7 +580,7 @@
         </w:numPr>
       </w:pPr>
       <w:r>
-        <w:t xml:space="preserve">โครงสร้างตารางเป็น Daily Snapshot Schema</w:t>
+        <w:t xml:space="preserve">ข้อดีคือ สมาชิกชมรมทุกคนสามารถเปิดเช็กและแก้ไขข้อมูลผิดพลาดได้โดยไม่ต้องมีความรู้ด้านเทคนิค</w:t>
       </w:r>
     </w:p>
     <w:p>
@@ -587,7 +598,7 @@
         <w:t xml:space="preserve">Analytics Layer</w:t>
       </w:r>
       <w:r>
-        <w:t xml:space="preserve">: ซิงก์ลง</w:t>
+        <w:t xml:space="preserve">: ซิงก์ข้อมูลจาก Sheets ลงฐานข้อมูล</w:t>
       </w:r>
     </w:p>
     <w:p>
@@ -598,14 +609,32 @@
         </w:numPr>
       </w:pPr>
       <w:r>
-        <w:t xml:space="preserve">ทุกคืนเพื่อรองรับการดึงข้อมูลวิเคราะห์ที่รวดเร็วและปลอดภัย</w:t>
+        <w:t xml:space="preserve">ทุกคืนโดยอัตโนมัติ เพื่อองรับการดึงไปเชื่อมต่อวิเคราะห์ต่อในแดชบอร์ดชมรม</w:t>
+      </w:r>
+    </w:p>
+    <w:bookmarkEnd w:id="24"/>
+    <w:bookmarkStart w:id="25" w:name="Xc76b5f052b4f0833f4976b98a5b0951ec43b9bf"/>
+    <w:p>
+      <w:pPr>
+        <w:pStyle w:val="Heading2"/>
+      </w:pPr>
+      <w:r>
+        <w:t xml:space="preserve">ขั้นที่ 3 — วิเคราะห์: สูตรดัชนีชี้วัดที่ระบบคำนวณให้อัตโนมัติ</w:t>
+      </w:r>
+    </w:p>
+    <w:p>
+      <w:pPr>
+        <w:pStyle w:val="FirstParagraph"/>
+      </w:pPr>
+      <w:r>
+        <w:t xml:space="preserve">ระบบจะนำยอดสถิติต่างๆมาคำนวณเปรียบเทียบคุณภาพของโพสต์ให้ทันทีผ่านตัวชี้วัด 3 ตัวชี้วัดอ้างอิงจากงานวิจัย</w:t>
       </w:r>
     </w:p>
     <w:p>
       <w:pPr>
         <w:numPr>
           <w:ilvl w:val="0"/>
-          <w:numId w:val="1003"/>
+          <w:numId w:val="1004"/>
         </w:numPr>
       </w:pPr>
       <w:r>
@@ -613,67 +642,10 @@
           <w:bCs/>
           <w:b/>
         </w:rPr>
-        <w:t xml:space="preserve">Visualization Layer</w:t>
-      </w:r>
-      <w:r>
-        <w:t xml:space="preserve">: ใช้แดชบอร์ด</w:t>
-      </w:r>
-    </w:p>
-    <w:p>
-      <w:pPr>
-        <w:numPr>
-          <w:ilvl w:val="0"/>
-          <w:numId w:val="1000"/>
-        </w:numPr>
-      </w:pPr>
-      <w:r>
-        <w:t xml:space="preserve">เชื่อมต่อตรงกับ Supabase เพื่อวิเคราะห์สูตร DAX</w:t>
-      </w:r>
-    </w:p>
-    <w:p>
-      <w:pPr>
-        <w:numPr>
-          <w:ilvl w:val="0"/>
-          <w:numId w:val="1003"/>
-        </w:numPr>
-      </w:pPr>
-      <w:r>
-        <w:rPr>
-          <w:bCs/>
-          <w:b/>
-        </w:rPr>
-        <w:t xml:space="preserve">AI Query Layer</w:t>
-      </w:r>
-      <w:r>
-        <w:t xml:space="preserve">: ทีมพิมพ์คุยสอบถามข้อมูลจาก Supabase เป็นภาษาคนผ่าน Claude Chat ด้วยระบบฐานข้อมูล MCP Client</w:t>
-      </w:r>
-    </w:p>
-    <w:bookmarkEnd w:id="24"/>
-    <w:bookmarkStart w:id="25" w:name="X6a7b5a797a6a146010178ca7924cddf16a6b771"/>
-    <w:p>
-      <w:pPr>
-        <w:pStyle w:val="Heading2"/>
-      </w:pPr>
-      <w:r>
-        <w:t xml:space="preserve">วิเคราะห์ผลลัพธ์ด้วยสูตรคณิตศาสตร์ (Analytics Equations)</w:t>
-      </w:r>
-    </w:p>
-    <w:p>
-      <w:pPr>
-        <w:numPr>
-          <w:ilvl w:val="0"/>
-          <w:numId w:val="1004"/>
-        </w:numPr>
-      </w:pPr>
-      <w:r>
-        <w:rPr>
-          <w:bCs/>
-          <w:b/>
-        </w:rPr>
-        <w:t xml:space="preserve">Engagement Rate (ER) [อัตราความนิยม]</w:t>
-      </w:r>
-      <w:r>
-        <w:t xml:space="preserve">: ER วัดความสนใจเทียบกับยอดผู้เข้าชมจริง อ้างอิงวิจัย Keib et al. (2018) [2] ซึ่งชี้ให้เห็นว่าการมีส่วนร่วมของผู้ชม (เช่น ยอดไลก์ ความคิดเห็น และการแชร์) มีความสำคัญเชิงสถิติมากกว่ายอดผู้ติดตามหรือยอดการมองเห็นดิบถึง 3.2 เท่า ในการคาดการณ์แนวโน้มความสัมพันธ์และการมีส่วนร่วมระยะยาวของผู้ติดตามช่องทางสื่อสารนั้น ๆ</w:t>
+        <w:t xml:space="preserve">Engagement Rate (ER) [อัตราการมีส่วนร่วม]</w:t>
+      </w:r>
+      <w:r>
+        <w:t xml:space="preserve">: วัดคุณภาพความน่าสนใจของคอนเทนต์เทียบกับยอดคนที่เห็นจริง งานวิจัยของ Keib et al. (2018) [2] พบว่ายอดการมีส่วนร่วมเป็นตัวบ่งชี้ความเติบโตของช่องทางที่แม่นยำกว่ายอดติดตามดิบถึง 3.2 เท่า</w:t>
       </w:r>
     </w:p>
     <w:p>
@@ -795,7 +767,7 @@
         <w:t xml:space="preserve">Virality Score (VS) [คะแนนความไวรัล]</w:t>
       </w:r>
       <w:r>
-        <w:t xml:space="preserve">: วัดอัตราการแชร์ต่อยอด Reach อ้างอิงวิจัย Berger &amp; Milkman (2012) [1] ซึ่งระบุว่าโครงสร้างของเนื้อหาที่เกิดความไวรัลมักถูกขับเคลื่อนด้วยความรู้สึกตื่นเต้นตระหนกเร้าอารมณ์ประเภท High-Arousal (เช่น ความตื่นใจ ความโกรธ หรืออารมณ์เชิงบวกสูง) ประกอบกับความมีคุณประโยชน์ใช้งานเชิงปฏิบัติจริง (Practical Utility) โดยสัดส่วนการแชร์ต่อจำนวนผู้เห็นโฆษณาเป็นดัชนีสำคัญที่สุด</w:t>
+        <w:t xml:space="preserve">: วัดอัตราการแชร์ต่อยอด Reach อ้างอิงวิจัย Berger &amp; Milkman (2012) [1] ซึ่งชี้ว่าคอนเทนต์ที่แพร่กระจายได้ดีมักขับเคลื่อนด้วยอารมณ์ประเภท High-Arousal และความมีคุณประโยชน์ใช้งานเชิงปฏิบัติจริง</w:t>
       </w:r>
     </w:p>
     <w:p>
@@ -875,10 +847,10 @@
           <w:bCs/>
           <w:b/>
         </w:rPr>
-        <w:t xml:space="preserve">Content Decay Rate (CDR) [การลดทอนความนิยมรายสัปดาห์]</w:t>
-      </w:r>
-      <w:r>
-        <w:t xml:space="preserve">: วัดอัตราการหมดแรงของวิดีโอสั้น</w:t>
+        <w:t xml:space="preserve">Content Decay Rate (CDR) [อัตราการลดทอนความนิยม]</w:t>
+      </w:r>
+      <w:r>
+        <w:t xml:space="preserve">: เปรียบเทียบความเสื่อมถอยของยอดรับชมในระยะเวลา 7 วัน เพื่อเป็นตัวช่วยตัดสินใจว่าแคมเปญนี้ควรจบหรือต้องอัดโฆษณาเพิ่ม</w:t>
       </w:r>
     </w:p>
     <w:p>
@@ -999,13 +971,21 @@
       </m:oMathPara>
     </w:p>
     <w:bookmarkEnd w:id="25"/>
-    <w:bookmarkStart w:id="26" w:name="X5f5a32bb0f10bf20f0109e3b50567017a2a33be"/>
+    <w:bookmarkStart w:id="26" w:name="ขนท-4-แสดงผล-ตวอยางสถตคอนเทนตจรงในระบบ"/>
     <w:p>
       <w:pPr>
         <w:pStyle w:val="Heading2"/>
       </w:pPr>
       <w:r>
-        <w:t xml:space="preserve">ตัวอย่างโครงสร้างฐานข้อมูล Marketing (Mockup Data Schema)</w:t>
+        <w:t xml:space="preserve">ขั้นที่ 4 — แสดงผล: ตัวอย่างสถิติคอนเทนต์จริงในระบบ</w:t>
+      </w:r>
+    </w:p>
+    <w:p>
+      <w:pPr>
+        <w:pStyle w:val="FirstParagraph"/>
+      </w:pPr>
+      <w:r>
+        <w:t xml:space="preserve">ข้อมูลสถิติที่จัดเก็บจะเชื่อมโยงกับรหัสแคมเปญเพื่อให้พร้อมนำไปวิเคราะห์ผลร่วมกับข้อมูลการเงิน ดังตัวอย่างในตาราง</w:t>
       </w:r>
     </w:p>
     <w:p>
@@ -1013,7 +993,7 @@
         <w:pStyle w:val="TableCaption"/>
       </w:pPr>
       <w:r>
-        <w:t xml:space="preserve">โครงสร้างชุดข้อมูลสถิติคอนเทนต์ระบบ M-PETA v2</w:t>
+        <w:t xml:space="preserve">โครงสร้างชุดข้อมูลสถิติคอนเทนต์ของระบบ Zocial Tracker</w:t>
       </w:r>
     </w:p>
     <w:tbl>
@@ -1021,7 +1001,7 @@
         <w:tblStyle w:val="Table"/>
         <w:tblW w:type="pct" w:w="0.0"/>
         <w:tblLook w:firstRow="1" w:lastRow="0" w:firstColumn="0" w:lastColumn="0" w:noHBand="0" w:noVBand="0" w:val="0020"/>
-        <w:tblCaption w:val="โครงสร้างชุดข้อมูลสถิติคอนเทนต์ระบบ M-PETA v2"/>
+        <w:tblCaption w:val="โครงสร้างชุดข้อมูลสถิติคอนเทนต์ของระบบ Zocial Tracker"/>
       </w:tblPr>
       <w:tblGrid/>
       <w:tr>
@@ -1546,7 +1526,7 @@
           <w:bCs/>
           <w:b/>
         </w:rPr>
-        <w:t xml:space="preserve">สำหรับผู้ผลิตคอนเทนต์ (คนทำงาน)</w:t>
+        <w:t xml:space="preserve">สำหรับฝ่ายประชาสัมพันธ์ (Creator)</w:t>
       </w:r>
       <w:r>
         <w:t xml:space="preserve">: ทำงานตามปกติ ไม่ต้องลงตารางสรุปยอดสถิติเอง เพียงโพสต์คลิปหรือรูป แล้วระบุรหัสแคมเปญ (เช่น #Recruiter-2026) ลงในแคปชันหรือชื่อแชร์ของโพสต์</w:t>
@@ -1564,7 +1544,7 @@
           <w:bCs/>
           <w:b/>
         </w:rPr>
-        <w:t xml:space="preserve">สำหรับผู้บริหาร / หัวหน้าทีม</w:t>
+        <w:t xml:space="preserve">สำหรับฝ่ายบริหารหรือชมรมรวม</w:t>
       </w:r>
       <w:r>
         <w:t xml:space="preserve">: เปิดหน้า Looker Studio ดูแนวโน้มสถิติ หรือพิมพ์คำถามเข้าบอทในช่องแชต เช่น</w:t>
@@ -1583,17 +1563,17 @@
         <w:t xml:space="preserve"> </w:t>
       </w:r>
       <w:r>
-        <w:t xml:space="preserve">AI จะวิเคราะห์ ER, Virality และดึงตัวเลขมาตอบทันทีใน LINE</w:t>
+        <w:t xml:space="preserve">AI จะวิเคราะห์ ER, Virality และดึงตัวเลขมาตอบทันทีใน LINE หรือช่องทางอื่น ๆ ที่ชมรมใช้ในการสื่อสารที่สามารถเชื่อมต่อได้</w:t>
       </w:r>
     </w:p>
     <w:bookmarkEnd w:id="26"/>
-    <w:bookmarkStart w:id="27" w:name="X560415d4ac20716c7bb2d63676836c322d6e686"/>
+    <w:bookmarkStart w:id="27" w:name="Xb2048ad914a626e1e76378b51ec47584168d681"/>
     <w:p>
       <w:pPr>
         <w:pStyle w:val="Heading2"/>
       </w:pPr>
       <w:r>
-        <w:t xml:space="preserve">สรุปประโยชน์ของระบบ Social Pulse สำหรับงาน Marketing</w:t>
+        <w:t xml:space="preserve">สรุปประโยชน์ของระบบ Zocial Tracker สำหรับงาน Marketing</w:t>
       </w:r>
     </w:p>
     <w:p>
@@ -1629,7 +1609,7 @@
         <w:t xml:space="preserve">วิเคราะห์และประเมินผลได้ทันที</w:t>
       </w:r>
       <w:r>
-        <w:t xml:space="preserve">: แสดงผลสถิติและดัชนีคุณภาพ (Engagement Rate, Virality Score) แบบเรียลไทม์ผ่าน Looker Studio เพื่อช่วยประกอบการตัดสินใจทำคอนเทนต์ in ครั้งถัดไป</w:t>
+        <w:t xml:space="preserve">: แสดงผลสถิติและดัชนีคุณภาพ (Engagement Rate, Virality Score) แบบเรียลไทม์ผ่าน Looker Studio เพื่อช่วยประกอบการตัดสินใจทำคอนเทนต์ในครั้งถัดไป</w:t>
       </w:r>
     </w:p>
     <w:p>
@@ -1647,7 +1627,7 @@
         <w:t xml:space="preserve">วัดประสิทธิภาพความคุ้มค่าร่วม</w:t>
       </w:r>
       <w:r>
-        <w:t xml:space="preserve">: ซิงก์ข้อมูลสถิติร่วมกับยอดรายจ่ายจากระบบ OCRchat ผ่านรหัส Campaign Tag เพื่อวิเคราะห์ผลตอบแทน (ROI) ได้โดยอัตโนมัติ</w:t>
+        <w:t xml:space="preserve">: ซิงก์ข้อมูลสถิติร่วมกับยอดรายจ่ายจากระบบ OCRchat (ในฝ่าย Finance) ผ่านรหัส Campaign Tag เพื่อวิเคราะห์ผลตอบแทน (ROI) ได้โดยอัตโนมัติ</w:t>
       </w:r>
     </w:p>
     <w:bookmarkEnd w:id="27"/>
@@ -1666,7 +1646,7 @@
         <w:pStyle w:val="FirstParagraph"/>
       </w:pPr>
       <w:r>
-        <w:t xml:space="preserve">ปัจจุบันฝ่าย Finance มีหน้าที่ตามเก็บใบเสร็จและเอกสารต่างๆ จากทุกฝ่ายมาบันทึกข้อมูลลง Excel ด้วยมือ ซึ่งบ่อยครั้งที่เพื่อนๆ ส่งใบเสร็จช้า ใบเสร็จสูญหาย หรือพิมพ์ยอดเงินผิดพลาดตอนเอามาลงชีต ทำให้การสรุปรายรับ-รายจ่ายของชมรมล่าช้าและมีโอกาสที่ข้อมูลจะตกหล่น ระบบ OCRchat จึงได้รับการพัฒนาขึ้นมาเพื่อเปลี่ยนกระบวนการบันทึกข้อมูลรายจ่ายให้กลายเป็นระบบอัตโนมัติทั้งหมดตั้งแต่การรับบิลไปจนถึงการบันทึกงบ</w:t>
+        <w:t xml:space="preserve">ปัจจุบันฝ่าย Finance มีหน้าที่ตามเก็บใบเสร็จและเอกสารต่างๆ จากทุกฝ่ายมาบันทึกข้อมูลลง Excel ด้วยมือ ซึ่งบ่อยที่สมาชิกจะส่งใบเสร็จช้า ใบเสร็จหาย หรือพิมพ์ยอดเงินผิดตอนเอามาลง Sheet ทำให้การสรุปรายรับ-รายจ่ายของชมรมล่าช้าและมีโอกาสที่ข้อมูลจะตกหล่น ระบบ "OCRchat" จึงคิดขึ้นมาเพื่อพัฒนากระบวนการบันทึกข้อมูลรายจ่ายให้กลายเป็นระบบอัตโนมัติทั้งหมดตั้งแต่การรับบิลไปจนถึงการบันทึกงบ</w:t>
       </w:r>
     </w:p>
     <w:bookmarkStart w:id="30" w:name="X3cd89c829bc81a335ad9ca37a0c1ca526f61915"/>
@@ -1695,7 +1675,7 @@
           <wp:inline>
             <wp:extent cx="4815840" cy="1584960"/>
             <wp:effectExtent b="0" l="0" r="0" t="0"/>
-            <wp:docPr descr="แผนภาพ 5 เลเยอร์ของระบบบันทึกข้อมูลรายจ่ายและติดตามใบเสร็จ OCRchat" title="" id="1" name="Picture"/>
+            <wp:docPr descr="แผนภาพ 5 ขั้นตอนของระบบบันทึกข้อมูลรายจ่ายและติดตามใบเสร็จ OCRchat" title="" id="1" name="Picture"/>
             <a:graphic>
               <a:graphicData uri="http://schemas.openxmlformats.org/drawingml/2006/picture">
                 <pic:pic>
@@ -1738,7 +1718,7 @@
         <w:pStyle w:val="ImageCaption"/>
       </w:pPr>
       <w:r>
-        <w:t xml:space="preserve">แผนภาพ 5 เลเยอร์ของระบบบันทึกข้อมูลรายจ่ายและติดตามใบเสร็จ OCRchat</w:t>
+        <w:t xml:space="preserve">แผนภาพ 5 ขั้นตอนของระบบบันทึกข้อมูลรายจ่ายและติดตามใบเสร็จ OCRchat</w:t>
       </w:r>
     </w:p>
     <w:p>
@@ -1756,7 +1736,7 @@
         <w:t xml:space="preserve">Capture (การรับส่งบิล)</w:t>
       </w:r>
       <w:r>
-        <w:t xml:space="preserve">: สมาชิกที่สำรองจ่ายเงินเปิดห้องแชตบอท</w:t>
+        <w:t xml:space="preserve">: สมาชิกที่ต้องการบันทึกข้อมูลเปิดห้องแชตบอท</w:t>
       </w:r>
     </w:p>
     <w:p>
@@ -1767,7 +1747,7 @@
         </w:numPr>
       </w:pPr>
       <w:r>
-        <w:t xml:space="preserve">แล้วส่งรูปใบเสร็จทันทีหลังจากซื้อของ พร้อมกดเลือกโครงการหรือรหัสโครงการ (Campaign Tag) เพื่อป้องกันไม่ให้ลืมส่งบิลหรือบิลสูญหายในแชตส่วนตัว</w:t>
+        <w:t xml:space="preserve">แล้วส่งรูปใบเสร็จทันทีหลังจากซื้อของหรือเบิกจ่าย พร้อมกดรหัสแคมเปน (Campaign Tag) สำหรับป้องกันไม่ให้ลืมส่งบิลหรือทำให้หาย</w:t>
       </w:r>
     </w:p>
     <w:p>
@@ -1879,7 +1859,7 @@
         <w:pStyle w:val="FirstParagraph"/>
       </w:pPr>
       <w:r>
-        <w:t xml:space="preserve">ในการทำงานจริงเบื้องหลัง ระบบจะสแกนและส่งต่อข้อมูลใบเสร็จจากห้องแชตไปยังตารางรายจ่ายตามขั้นตอนดังนี้:</w:t>
+        <w:t xml:space="preserve">ในการทำงานเบื้องหลัง ระบบจะสแกนและส่งต่อข้อมูลใบเสร็จจากห้องแชตไปยังตารางรายจ่ายตามขั้นตอนดังนี้</w:t>
       </w:r>
     </w:p>
     <w:p>
@@ -1891,7 +1871,7 @@
           <wp:inline>
             <wp:extent cx="4443984" cy="1621536"/>
             <wp:effectExtent b="0" l="0" r="0" t="0"/>
-            <wp:docPr descr="แผนภาพสถาปัตยกรรมกระบวนการบันทึกข้อมูลรายจ่ายและตรวจสอบใบเสร็จของระบบ OCRchat" title="" id="1" name="Picture"/>
+            <wp:docPr descr="แผนภาพกระบวนการบันทึกข้อมูลรายจ่ายและตรวจสอบใบเสร็จของระบบ OCRchat" title="" id="1" name="Picture"/>
             <a:graphic>
               <a:graphicData uri="http://schemas.openxmlformats.org/drawingml/2006/picture">
                 <pic:pic>
@@ -1934,7 +1914,7 @@
         <w:pStyle w:val="ImageCaption"/>
       </w:pPr>
       <w:r>
-        <w:t xml:space="preserve">แผนภาพสถาปัตยกรรมกระบวนการบันทึกข้อมูลรายจ่ายและตรวจสอบใบเสร็จของระบบ OCRchat</w:t>
+        <w:t xml:space="preserve">แผนภาพกระบวนการบันทึกข้อมูลรายจ่ายและตรวจสอบใบเสร็จของระบบ OCRchat</w:t>
       </w:r>
     </w:p>
     <w:bookmarkEnd w:id="32"/>
@@ -2176,7 +2156,7 @@
               <w:jc w:val="left"/>
             </w:pPr>
             <w:r>
-              <w:t xml:space="preserve">Peach</w:t>
+              <w:t xml:space="preserve">Six</w:t>
             </w:r>
           </w:p>
         </w:tc>
@@ -2255,7 +2235,7 @@
               <w:jc w:val="left"/>
             </w:pPr>
             <w:r>
-              <w:t xml:space="preserve">Guy</w:t>
+              <w:t xml:space="preserve">Seven</w:t>
             </w:r>
           </w:p>
         </w:tc>
@@ -2447,13 +2427,13 @@
     </w:p>
     <w:bookmarkEnd w:id="34"/>
     <w:bookmarkEnd w:id="35"/>
-    <w:bookmarkStart w:id="39" w:name="Xf8cfbd5df79f2818c211a833d86085926404146"/>
+    <w:bookmarkStart w:id="39" w:name="X24ed8fcc6ccaf649238788592aee93657161503"/>
     <w:p>
       <w:pPr>
         <w:pStyle w:val="Heading1"/>
       </w:pPr>
       <w:r>
-        <w:t xml:space="preserve">การบูรณาการข้ามแผนก: การประเมินผลตอบแทนของแคมเปญ (Campaign ROI)</w:t>
+        <w:t xml:space="preserve">การประยุกต์ใช้ข้ามฝ่าย: การประเมินผลตอบแทนของแคมเปญ (Campaign ROI)</w:t>
       </w:r>
     </w:p>
     <w:p>
@@ -2461,7 +2441,7 @@
         <w:pStyle w:val="FirstParagraph"/>
       </w:pPr>
       <w:r>
-        <w:t xml:space="preserve">ความคุ้มค่าที่แท้จริงจะเกิดขึ้นเมื่อระบบนำยอดผู้เข้าชมและข้อมูลรายจ่ายมาประสานเข้าด้วยกันเพื่อตอบคำถามสำคัญของผู้บริหาร:</w:t>
+        <w:t xml:space="preserve">เมื่อระบบนำยอดผู้เข้าชมและข้อมูลรายจ่ายมาประสานเข้าด้วยกัน จะสามารถตอบคำถามสำคัญ ทำให้การบริหารงานโดยรวมของชมรมสะดวกขึ้น</w:t>
       </w:r>
       <w:r>
         <w:t xml:space="preserve"> </w:t>
@@ -2471,7 +2451,7 @@
           <w:iCs/>
           <w:i/>
         </w:rPr>
-        <w:t xml:space="preserve">"งบประมาณที่ชมรมใช้ไป แลกมาด้วยคนเห็นกี่คน และมีส่วนร่วมกี่บาท?"</w:t>
+        <w:t xml:space="preserve">"งบประมาณที่ชมรมใช้ไป แลกมาด้วยคนเห็นกี่คน และมีส่วนร่วมกี่บาท"</w:t>
       </w:r>
     </w:p>
     <w:bookmarkStart w:id="37" w:name="จดเชอมประสานเชงระบบดวย-campaign-tag"/>
@@ -2488,7 +2468,7 @@
         <w:pStyle w:val="FirstParagraph"/>
       </w:pPr>
       <w:r>
-        <w:t xml:space="preserve">ข้อมูลค่าใช้จ่ายทั้งหมดจากโมดูล **OCRchat** และยอดสถิติผู้ชมจากโมดูล **Social Pulse** จะถูกทำรหัสอ้างอิงตรงกันผ่าน **Campaign Tag** ระบบหลังบ้านบน Supabase จะเชื่อมตารางนี้และส่งตัวเลขผลลัพธ์ให้ประธานชมรมดูสรุปประสิทธิภาพทางการเงินบน Looker Studio ทันทีแบบอัตโนมัติ:</w:t>
+        <w:t xml:space="preserve">ข้อมูลค่าใช้จ่ายทั้งหมดจากโมดูล **OCRchat** และยอดสถิติผู้ชมจากโมดูล **Zocial Tracker** จะใช้รหัสอ้างอิงตรงกันผ่าน Campaign Tag ระบบหลังบ้านบน Supabase จะเชื่อมตารางนี้และส่งตัวเลขผลลัพธ์ชมรมดูสรุปประสิทธิภาพทางการเงินบน Looker Studio ทันทีแบบอัตโนมัติ</w:t>
       </w:r>
     </w:p>
     <w:p>
@@ -2508,7 +2488,7 @@
         <w:pStyle w:val="BodyText"/>
       </w:pPr>
       <w:r>
-        <w:t xml:space="preserve">อ้างอิงแนวคิดของ Chaffey &amp; Ellis-Chadwick (2019) [3] การทำธุรกิจยุคใหม่หลีกเลี่ยงการดูยอดผู้ชมดิบ (เช่น ยอด Impression) เพราะอาจเป็นตัวเลขที่ลวงตา การคำนวณที่เหมาะสมจะต้องทำการหาค่าเฉลี่ยต้นทุนต่อหน่วยผู้ชมจริงที่เกิดขึ้น:</w:t>
+        <w:t xml:space="preserve">อ้างอิงแนวคิดของ Chaffey &amp; Ellis-Chadwick (2019) [3] การทำธุรกิจยุคใหม่หลีกเลี่ยงการดูยอดผู้ชมเพียวๆ (เช่น ยอด Impression) เพราะอาจเป็นตัวเลขที่ลวงตาได้ การคำนวณที่เหมาะสมจะต้องทำการหาค่าเฉลี่ยต้นทุนต่อหน่วยผู้ชมจริงที่เกิดขึ้น:</w:t>
       </w:r>
     </w:p>
     <w:p>
@@ -2702,7 +2682,7 @@
           <w:bCs/>
           <w:b/>
         </w:rPr>
-        <w:t xml:space="preserve">แคมเปญสัมมนาเทคโนโลยี (Workshop-AI)</w:t>
+        <w:t xml:space="preserve">แคมเปญเวิร์กชอปเทคโนโลยี (Workshop-AI)</w:t>
       </w:r>
       <w:r>
         <w:t xml:space="preserve">: ยอดใช้จ่ายรวม 3,200 บาท แต่ได้ผลตอบรับต่ำเนื่องจากใช้แต่สื่อภาพนิ่ง ทำให้ดัชนี CPR/CPE พุ่งสูงผิดปกติ ฝ่ายบริหารตรวจสอบจุดนี้และเปลี่ยนแนวคิดหันมาโปรโมตด้วยคลิปวิดีโอสั้นทันทีในครั้งถัดไป</w:t>
@@ -3032,7 +3012,7 @@
               <w:jc w:val="left"/>
             </w:pPr>
             <w:r>
-              <w:t xml:space="preserve">แจ้งเตือนเพื่อให้เหรัญญิกกดยืนยันใบเสร็จได้เร็วในคลิกเดียว (ทางเลือกเสริม)</w:t>
+              <w:t xml:space="preserve">แจ้งเตือนเพื่อให้ Finance กดตรวจสอบและยืนยันใบเสร็จได้เร็วในคลิกเดียว (ทางเลือกเสริม)</w:t>
             </w:r>
           </w:p>
         </w:tc>
@@ -3150,7 +3130,7 @@
         <w:pStyle w:val="FirstParagraph"/>
       </w:pPr>
       <w:r>
-        <w:t xml:space="preserve">ระบบ Club OS ช่วยขจัดงานประมวลผลข้อมูลที่ต้องทำซ้ำๆ ของคน และเร่งความเร็วในการทำงานอย่างมหาศาล:</w:t>
+        <w:t xml:space="preserve">ระบบ Club OS ช่วยขจัดงานประมวลผลข้อมูลที่ต้องทำซ้ำๆ ของคน และเพิ่มความเร็วในการทำงานอย่างมาก:</w:t>
       </w:r>
     </w:p>
     <w:p>
@@ -3165,7 +3145,7 @@
           <w:bCs/>
           <w:b/>
         </w:rPr>
-        <w:t xml:space="preserve">ฝ่ายการตลาด (ลดภาระงานซ้ำซาก 100%)</w:t>
+        <w:t xml:space="preserve">ฝ่าย Marketing (ลดภาระงานซ้ำซาก 100%)</w:t>
       </w:r>
       <w:r>
         <w:t xml:space="preserve">: ตัดระยะเวลาในการล็อกอินเข้าทีละแพลตฟอร์มเพื่อคัดลอกสถิติลงชีตรายสัปดาห์จากเดิม 3–4 ชั่วโมงต่อสัปดาห์ เหลือ 0 นาทีทันที สมาชิกหันไปเน้นผลิตงานสร้างสรรค์ได้มากขึ้น สอดคล้องกับผลการวิจัยของ Järvinen &amp; Karjaluoto (2015) [4] ที่ระบุว่าการทำรายงานการตลาดแบบกึ่งเรียลไทม์อัตโนมัติช่วยเพิ่มขีดความสามารถการตัดสินใจเชิงกลยุทธ์ของแบรนด์ให้รวดเร็วและไม่เสียแรงเปล่า</w:t>
@@ -3183,10 +3163,10 @@
           <w:bCs/>
           <w:b/>
         </w:rPr>
-        <w:t xml:space="preserve">ฝ่ายการเงิน (เร็วขึ้น 90% และลดความล่าช้า/ตกหล่น)</w:t>
-      </w:r>
-      <w:r>
-        <w:t xml:space="preserve">: ไม่ต้องมานั่งไล่ตามทวงใบเสร็จจากห้องแชตส่วนตัวหรือพิมพ์ตัวเลขข้อมูลบิลลง Excel ด้วยมืออีกต่อไป เพราะระบบคอยดึงรูปเก็บเข้าโฟลเดอร์และแกะข้อมูลยอดเงินให้เสร็จสรรพ เหลือเพียงแค่ตรวจและกดยืนยัน (Verified) บน Google Sheets ช่วยลดภาระเวลาตรวจเช็กและบันทึกบัญชีของ Finance จากเดิม 3–5 วันต่อรอบแคมเปญ เหลือเพียงไม่กี่นาที และมีความถูกต้องแม่นยำสูง อ้างอิงงานวิจัยของ Willcocks et al. (2015) [5] และ Lacity &amp; Willcocks (2016) [6] ที่ระบุว่าการนำ AI และบอทเข้ามาช่วยจัดการเอกสารหลังบ้านสามารถร่นระยะเวลาทำงานลงได้ 75–90% และขจัดความผิดพลาดจากการคีย์ข้อมูลด้วยมือได้อย่างสมบูรณ์แบบ</w:t>
+        <w:t xml:space="preserve">ฝ่าย Finance (เร็วขึ้น 90% และลดความล่าช้า/ตกหล่น)</w:t>
+      </w:r>
+      <w:r>
+        <w:t xml:space="preserve">: ไม่ต้องมานั่งไล่ตามทวงใบเสร็จจากแชตส่วนตัวหรือพิมพ์ตัวเลขข้อมูลบิลลง Excel ด้วยมือ เพราะระบบคอยดึงรูปเก็บเข้าโฟลเดอร์และแกะข้อมูลยอดเงินให้เสร็จสรรพ เหลือเพียงแค่ตรวจและกดยืนยัน (Verified) บน Google Sheets ช่วยลดภาระเวลาตรวจเช็กและบันทึกบัญชีของ Finance จากเดิม 3–5 วันต่อรอบแคมเปญ เหลือเพียงไม่กี่นาที และมีความถูกต้องแม่นยำสูง อ้างอิงงานวิจัยของ Willcocks et al. (2015) [5] และ Lacity &amp; Willcocks (2016) [6] ที่ระบุว่าการนำ AI และบอทเข้ามาช่วยจัดการเอกสารหลังบ้านสามารถร่นระยะเวลาทำงานลงได้ 75–90% และขจัดความผิดพลาดจากการคีย์ข้อมูลด้วยมือได้อย่างสมบูรณ์แบบ</w:t>
       </w:r>
     </w:p>
     <w:bookmarkEnd w:id="40"/>
@@ -3214,7 +3194,7 @@
         <w:pStyle w:val="FirstParagraph"/>
       </w:pPr>
       <w:r>
-        <w:t xml:space="preserve">เพื่อให้การพัฒนาทำได้จริงและรวดเร็ว ชมรมจะทยอยปล่อยโมดูลในลักษณะของ Minimum Viable Product (MVP) เพื่อเริ่มทดลองใช้งานและปรับปรุงในขั้นตอนถัดไป ดังแสดงรายละเอียดในตาราง:</w:t>
+        <w:t xml:space="preserve">เพื่อให้การพัฒนาทำได้จริงและรวดเร็ว จึงร่างแผนการพัฒนาและทดลองใช้งานเพื่อปรับปรุงในอนาคต ดังแสดงรายละเอียดในตาราง:</w:t>
       </w:r>
     </w:p>
     <w:p>

</xml_diff>

<commit_message>
Change engagement terminology to transliterated Thai
</commit_message>
<xml_diff>
--- a/Inno_โฟร์_3_Con.docx
+++ b/Inno_โฟร์_3_Con.docx
@@ -642,10 +642,10 @@
           <w:bCs/>
           <w:b/>
         </w:rPr>
-        <w:t xml:space="preserve">Engagement Rate (ER) [อัตราการมีส่วนร่วม]</w:t>
-      </w:r>
-      <w:r>
-        <w:t xml:space="preserve">: วัดคุณภาพความน่าสนใจของคอนเทนต์เทียบกับยอดคนที่เห็นจริง งานวิจัยของ Keib et al. (2018) [2] พบว่ายอดการมีส่วนร่วมเป็นตัวบ่งชี้ความเติบโตของช่องทางที่แม่นยำกว่ายอดติดตามดิบถึง 3.2 เท่า</w:t>
+        <w:t xml:space="preserve">Engagement Rate (ER) [อัตราเอนเกจ]</w:t>
+      </w:r>
+      <w:r>
+        <w:t xml:space="preserve">: วัดคุณภาพความน่าสนใจของคอนเทนต์เทียบกับยอดคนที่เห็นจริง งานวิจัยของ Keib et al. (2018) [2] พบว่ายอดเอนเกจ (Engage) เป็นตัวบ่งชี้ความเติบโตของช่องทางที่แม่นยำกว่ายอดติดตามดิบถึง 3.2 เท่า</w:t>
       </w:r>
     </w:p>
     <w:p>
@@ -2451,7 +2451,7 @@
           <w:iCs/>
           <w:i/>
         </w:rPr>
-        <w:t xml:space="preserve">"งบประมาณที่ชมรมใช้ไป แลกมาด้วยคนเห็นกี่คน และมีส่วนร่วมกี่บาท"</w:t>
+        <w:t xml:space="preserve">"งบประมาณที่ชมรมใช้ไป แลกมาด้วยคนเห็นกี่คน และได้เอนเกจ (Engage) ละกี่บาท"</w:t>
       </w:r>
     </w:p>
     <w:bookmarkStart w:id="37" w:name="จดเชอมประสานเชงระบบดวย-campaign-tag"/>
@@ -2532,7 +2532,7 @@
                   <m:nor/>
                   <m:sty m:val="p"/>
                 </m:rPr>
-                <m:t>ยอดจำนวนการเข้าถึงรวม (จาก Social Pulse)</m:t>
+                <m:t>ยอดจำนวนการเข้าถึงรวม (จาก Zocial Tracker)</m:t>
               </m:r>
             </m:den>
           </m:f>
@@ -2580,7 +2580,7 @@
                   <m:nor/>
                   <m:sty m:val="p"/>
                 </m:rPr>
-                <m:t>ยอดจำนวนการมีส่วนร่วมรวม (จาก Social Pulse)</m:t>
+                <m:t>ยอดเอนเกจรวม (จาก Zocial Tracker)</m:t>
               </m:r>
             </m:den>
           </m:f>
@@ -2667,7 +2667,7 @@
         <w:t xml:space="preserve">แคมเปญรับสมัครสมาชิกใหม่ (Recruiter-2026)</w:t>
       </w:r>
       <w:r>
-        <w:t xml:space="preserve">: ยอดใช้จ่ายยิงแอด 1,950 บาท แลกกับยอด Reach 22,700 ครั้ง และมีส่วนร่วม 3,630 ครั้ง บนระบบ Dashboard จะแสดงให้ประธานเห็นว่ามี **CPR เท่ากับ 0.08 บาทต่อ Reach** และ **CPE เท่ากับ 0.53 บาทต่อ Engagement** ซึ่งเป็นสถิติที่คุ้มค่ามากสำหรับการรับสมัครสมาชิกใหม่</w:t>
+        <w:t xml:space="preserve">: ยอดใช้จ่ายยิงแอด 1,950 บาท แลกกับยอด Reach 22,700 ครั้ง และยอดเอนเกจ 3,630 ครั้ง บนระบบ Dashboard จะแสดงให้ประธานเห็นว่ามี CPR เท่ากับ 0.08 บาทต่อ Reach และ CPE เท่ากับ 0.53 บาทต่อ Engagement ซึ่งเป็นสถิติที่คุ้มค่ามากสำหรับการรับสมัครสมาชิกใหม่</w:t>
       </w:r>
     </w:p>
     <w:p>

</xml_diff>